<commit_message>
Update COVID report for PDSA II project with new content
</commit_message>
<xml_diff>
--- a/docs/reports/individual/adithya/COVID - 16110762 - NIBM - COBSCCOMP242P-065 - PDSAII.docx
+++ b/docs/reports/individual/adithya/COVID - 16110762 - NIBM - COBSCCOMP242P-065 - PDSAII.docx
@@ -453,17 +453,12 @@
           <w:smallCaps w:val="0"/>
           <w:noProof w:val="0"/>
           <w:color w:val="000000" w:themeColor="text1" w:themeTint="FF" w:themeShade="FF"/>
-          <w:sz w:val="28"/>
-          <w:szCs w:val="28"/>
+          <w:sz w:val="26"/>
+          <w:szCs w:val="26"/>
           <w:lang w:val="en-US"/>
         </w:rPr>
       </w:pPr>
-    </w:p>
-    <w:p>
-      <w:pPr>
-        <w:spacing w:after="0" w:line="360" w:lineRule="auto"/>
-        <w:ind w:left="720" w:firstLine="720"/>
-        <w:jc w:val="both"/>
+      <w:r>
         <w:rPr>
           <w:rFonts w:ascii="Times New Roman" w:hAnsi="Times New Roman" w:eastAsia="Times New Roman" w:cs="Times New Roman"/>
           <w:b w:val="0"/>
@@ -478,7 +473,8 @@
           <w:szCs w:val="26"/>
           <w:lang w:val="en-US"/>
         </w:rPr>
-      </w:pPr>
+        <w:t xml:space="preserve">           </w:t>
+      </w:r>
       <w:r>
         <w:rPr>
           <w:rFonts w:ascii="Times New Roman" w:hAnsi="Times New Roman" w:eastAsia="Times New Roman" w:cs="Times New Roman"/>
@@ -494,7 +490,116 @@
           <w:szCs w:val="26"/>
           <w:lang w:val="en-US"/>
         </w:rPr>
-        <w:t xml:space="preserve">           M.D.S.Y RANARAJA- COCOBSCCOMP2</w:t>
+        <w:t xml:space="preserve">E M A S B EKANAYAKA – </w:t>
+      </w:r>
+      <w:r>
+        <w:rPr>
+          <w:rFonts w:ascii="Times New Roman" w:hAnsi="Times New Roman" w:eastAsia="Times New Roman" w:cs="Times New Roman"/>
+          <w:b w:val="0"/>
+          <w:bCs w:val="0"/>
+          <w:i w:val="0"/>
+          <w:iCs w:val="0"/>
+          <w:caps w:val="0"/>
+          <w:smallCaps w:val="0"/>
+          <w:noProof w:val="0"/>
+          <w:color w:val="000000" w:themeColor="text1" w:themeTint="FF" w:themeShade="FF"/>
+          <w:sz w:val="26"/>
+          <w:szCs w:val="26"/>
+          <w:lang w:val="en-US"/>
+        </w:rPr>
+        <w:t>COBSCCOMP2</w:t>
+      </w:r>
+      <w:r>
+        <w:rPr>
+          <w:rFonts w:ascii="Times New Roman" w:hAnsi="Times New Roman" w:eastAsia="Times New Roman" w:cs="Times New Roman"/>
+          <w:b w:val="0"/>
+          <w:bCs w:val="0"/>
+          <w:i w:val="0"/>
+          <w:iCs w:val="0"/>
+          <w:caps w:val="0"/>
+          <w:smallCaps w:val="0"/>
+          <w:noProof w:val="0"/>
+          <w:color w:val="000000" w:themeColor="text1" w:themeTint="FF" w:themeShade="FF"/>
+          <w:sz w:val="26"/>
+          <w:szCs w:val="26"/>
+          <w:lang w:val="en-US"/>
+        </w:rPr>
+        <w:t>4</w:t>
+      </w:r>
+      <w:r>
+        <w:rPr>
+          <w:rFonts w:ascii="Times New Roman" w:hAnsi="Times New Roman" w:eastAsia="Times New Roman" w:cs="Times New Roman"/>
+          <w:b w:val="0"/>
+          <w:bCs w:val="0"/>
+          <w:i w:val="0"/>
+          <w:iCs w:val="0"/>
+          <w:caps w:val="0"/>
+          <w:smallCaps w:val="0"/>
+          <w:noProof w:val="0"/>
+          <w:color w:val="000000" w:themeColor="text1" w:themeTint="FF" w:themeShade="FF"/>
+          <w:sz w:val="26"/>
+          <w:szCs w:val="26"/>
+          <w:lang w:val="en-US"/>
+        </w:rPr>
+        <w:t>2</w:t>
+      </w:r>
+      <w:r>
+        <w:rPr>
+          <w:rFonts w:ascii="Times New Roman" w:hAnsi="Times New Roman" w:eastAsia="Times New Roman" w:cs="Times New Roman"/>
+          <w:b w:val="0"/>
+          <w:bCs w:val="0"/>
+          <w:i w:val="0"/>
+          <w:iCs w:val="0"/>
+          <w:caps w:val="0"/>
+          <w:smallCaps w:val="0"/>
+          <w:noProof w:val="0"/>
+          <w:color w:val="000000" w:themeColor="text1" w:themeTint="FF" w:themeShade="FF"/>
+          <w:sz w:val="26"/>
+          <w:szCs w:val="26"/>
+          <w:lang w:val="en-US"/>
+        </w:rPr>
+        <w:t>-065</w:t>
+      </w:r>
+      <w:r>
+        <w:tab/>
+      </w:r>
+    </w:p>
+    <w:p>
+      <w:pPr>
+        <w:spacing w:after="0" w:line="360" w:lineRule="auto"/>
+        <w:ind w:firstLine="0"/>
+        <w:jc w:val="center"/>
+        <w:rPr>
+          <w:rFonts w:ascii="Times New Roman" w:hAnsi="Times New Roman" w:eastAsia="Times New Roman" w:cs="Times New Roman"/>
+          <w:b w:val="0"/>
+          <w:bCs w:val="0"/>
+          <w:i w:val="0"/>
+          <w:iCs w:val="0"/>
+          <w:caps w:val="0"/>
+          <w:smallCaps w:val="0"/>
+          <w:noProof w:val="0"/>
+          <w:color w:val="000000" w:themeColor="text1" w:themeTint="FF" w:themeShade="FF"/>
+          <w:sz w:val="26"/>
+          <w:szCs w:val="26"/>
+          <w:lang w:val="en-US"/>
+        </w:rPr>
+      </w:pPr>
+      <w:r>
+        <w:rPr>
+          <w:rFonts w:ascii="Times New Roman" w:hAnsi="Times New Roman" w:eastAsia="Times New Roman" w:cs="Times New Roman"/>
+          <w:b w:val="0"/>
+          <w:bCs w:val="0"/>
+          <w:i w:val="0"/>
+          <w:iCs w:val="0"/>
+          <w:caps w:val="0"/>
+          <w:smallCaps w:val="0"/>
+          <w:noProof w:val="0"/>
+          <w:color w:val="000000" w:themeColor="text1" w:themeTint="FF" w:themeShade="FF"/>
+          <w:sz w:val="26"/>
+          <w:szCs w:val="26"/>
+          <w:lang w:val="en-US"/>
+        </w:rPr>
+        <w:t>COVID – 16110762</w:t>
       </w:r>
     </w:p>
     <w:p>
@@ -20639,7 +20744,7 @@
     </w:p>
     <w:bookmarkEnd w:id="91"/>
     <w:bookmarkStart w:name="references" w:id="92"/>
-    <w:p xmlns:wp14="http://schemas.microsoft.com/office/word/2010/wordml" wp14:textId="77777777" wp14:noSpellErr="1">
+    <w:p xmlns:wp14="http://schemas.microsoft.com/office/word/2010/wordml" wp14:noSpellErr="1" wp14:textId="450521E5">
       <w:pPr>
         <w:pStyle w:val="Heading2"/>
       </w:pPr>
@@ -20649,93 +20754,166 @@
         <w:t>References</w:t>
       </w:r>
       <w:bookmarkEnd w:id="1100713308"/>
-    </w:p>
-    <w:p xmlns:wp14="http://schemas.microsoft.com/office/word/2010/wordml" wp14:textId="77777777">
-      <w:pPr>
-        <w:numPr>
-          <w:ilvl w:val="0"/>
-          <w:numId w:val="1032"/>
-        </w:numPr>
-        <w:pStyle w:val="Compact"/>
-      </w:pPr>
-      <w:r>
-        <w:t xml:space="preserve">Cormen, T. H., Leiserson, C. E., Rivest, R. L., &amp; Stein, C. (2022). Introduction to Algorithms (4th ed.). MIT Press.</w:t>
-      </w:r>
-    </w:p>
-    <w:p xmlns:wp14="http://schemas.microsoft.com/office/word/2010/wordml" wp14:textId="77777777">
-      <w:pPr>
-        <w:numPr>
-          <w:ilvl w:val="0"/>
-          <w:numId w:val="1032"/>
-        </w:numPr>
-        <w:pStyle w:val="Compact"/>
-      </w:pPr>
-      <w:r>
-        <w:t xml:space="preserve">Russell, S. J., &amp; Norvig, P. (2020). Artificial Intelligence: A Modern Approach (4th ed.). Pearson.</w:t>
-      </w:r>
-    </w:p>
-    <w:p xmlns:wp14="http://schemas.microsoft.com/office/word/2010/wordml" wp14:textId="77777777">
-      <w:pPr>
-        <w:numPr>
-          <w:ilvl w:val="0"/>
-          <w:numId w:val="1032"/>
-        </w:numPr>
-        <w:pStyle w:val="Compact"/>
-      </w:pPr>
-      <w:r>
-        <w:t xml:space="preserve">Sedgewick, R., &amp; Wayne, K. (2011). Algorithms (4th ed.). Addison-Wesley Professional.</w:t>
-      </w:r>
-    </w:p>
-    <w:p xmlns:wp14="http://schemas.microsoft.com/office/word/2010/wordml" wp14:textId="77777777">
-      <w:pPr>
-        <w:numPr>
-          <w:ilvl w:val="0"/>
-          <w:numId w:val="1032"/>
-        </w:numPr>
-        <w:pStyle w:val="Compact"/>
-      </w:pPr>
-      <w:r>
-        <w:t xml:space="preserve">Knuth, D. E. (2011). The Art of Computer Programming, Volume 4A: Combinatorial Algorithms, Part 1. Addison-Wesley Professional.</w:t>
-      </w:r>
-    </w:p>
-    <w:p xmlns:wp14="http://schemas.microsoft.com/office/word/2010/wordml" wp14:textId="77777777">
-      <w:pPr>
-        <w:numPr>
-          <w:ilvl w:val="0"/>
-          <w:numId w:val="1032"/>
-        </w:numPr>
-        <w:pStyle w:val="Compact"/>
-      </w:pPr>
-      <w:r>
-        <w:t xml:space="preserve">Skiena, S. S. (2020). The Algorithm Design Manual (3rd ed.). Springer.</w:t>
-      </w:r>
-    </w:p>
-    <w:p xmlns:wp14="http://schemas.microsoft.com/office/word/2010/wordml" wp14:textId="77777777">
-      <w:pPr>
-        <w:numPr>
-          <w:ilvl w:val="0"/>
-          <w:numId w:val="1032"/>
-        </w:numPr>
-        <w:pStyle w:val="Compact"/>
-      </w:pPr>
-      <w:r>
-        <w:t xml:space="preserve">Applegate, D. L., Bixby, R. E., Chvátal, V., &amp; Cook, W. J. (2007). The Traveling Salesman Problem: A Computational Study. Princeton University Press.</w:t>
-      </w:r>
-    </w:p>
-    <w:p xmlns:wp14="http://schemas.microsoft.com/office/word/2010/wordml" wp14:textId="77777777">
-      <w:pPr>
-        <w:numPr>
-          <w:ilvl w:val="0"/>
-          <w:numId w:val="1032"/>
-        </w:numPr>
-        <w:pStyle w:val="Compact"/>
-      </w:pPr>
-      <w:r>
-        <w:t xml:space="preserve">Browne, C., Powley, E., Whitehouse, D., et al. (2012). A Survey of Monte Carlo Tree Search Methods. IEEE Transactions on Computational Intelligence and AI in Games, 4(1), 1-43.</w:t>
-      </w:r>
     </w:p>
     <w:bookmarkEnd w:id="92"/>
     <w:bookmarkEnd w:id="93"/>
+    <w:p>
+      <w:pPr>
+        <w:pStyle w:val="ListParagraph"/>
+        <w:numPr>
+          <w:ilvl w:val="0"/>
+          <w:numId w:val="1033"/>
+        </w:numPr>
+        <w:spacing w:before="0" w:beforeAutospacing="off" w:after="0" w:afterAutospacing="off"/>
+        <w:rPr>
+          <w:noProof w:val="0"/>
+          <w:lang w:val="en-US"/>
+        </w:rPr>
+      </w:pPr>
+      <w:r>
+        <w:rPr>
+          <w:noProof w:val="0"/>
+          <w:lang w:val="en-US"/>
+        </w:rPr>
+        <w:t>Cormen, T. H., Leiserson, C. E., Rivest, R. L., &amp; Stein, C. (2022). Introduction to Algorithms (4th ed.). MIT Press.</w:t>
+      </w:r>
+    </w:p>
+    <w:p>
+      <w:pPr>
+        <w:pStyle w:val="ListParagraph"/>
+        <w:numPr>
+          <w:ilvl w:val="0"/>
+          <w:numId w:val="1033"/>
+        </w:numPr>
+        <w:spacing w:before="0" w:beforeAutospacing="off" w:after="0" w:afterAutospacing="off"/>
+        <w:rPr>
+          <w:noProof w:val="0"/>
+          <w:lang w:val="en-US"/>
+        </w:rPr>
+      </w:pPr>
+      <w:r>
+        <w:rPr>
+          <w:noProof w:val="0"/>
+          <w:lang w:val="en-US"/>
+        </w:rPr>
+        <w:t>Russell, S. J., &amp; Norvig, P. (2020). Artificial Intelligence: A Modern Approach (4th ed.). Pearson.</w:t>
+      </w:r>
+    </w:p>
+    <w:p>
+      <w:pPr>
+        <w:pStyle w:val="ListParagraph"/>
+        <w:numPr>
+          <w:ilvl w:val="0"/>
+          <w:numId w:val="1033"/>
+        </w:numPr>
+        <w:spacing w:before="0" w:beforeAutospacing="off" w:after="0" w:afterAutospacing="off"/>
+        <w:rPr>
+          <w:noProof w:val="0"/>
+          <w:lang w:val="en-US"/>
+        </w:rPr>
+      </w:pPr>
+      <w:r>
+        <w:rPr>
+          <w:noProof w:val="0"/>
+          <w:lang w:val="en-US"/>
+        </w:rPr>
+        <w:t>Sedgewick, R., &amp; Wayne, K. (2011). Algorithms (4th ed.). Addison-Wesley Professional.</w:t>
+      </w:r>
+    </w:p>
+    <w:p>
+      <w:pPr>
+        <w:pStyle w:val="ListParagraph"/>
+        <w:numPr>
+          <w:ilvl w:val="0"/>
+          <w:numId w:val="1033"/>
+        </w:numPr>
+        <w:spacing w:before="0" w:beforeAutospacing="off" w:after="0" w:afterAutospacing="off"/>
+        <w:rPr>
+          <w:noProof w:val="0"/>
+          <w:lang w:val="en-US"/>
+        </w:rPr>
+      </w:pPr>
+      <w:r>
+        <w:rPr>
+          <w:noProof w:val="0"/>
+          <w:lang w:val="en-US"/>
+        </w:rPr>
+        <w:t>Knuth, D. E. (2011). The Art of Computer Programming, Volume 4A: Combinatorial Algorithms, Part 1. Addison-Wesley Professional.</w:t>
+      </w:r>
+    </w:p>
+    <w:p>
+      <w:pPr>
+        <w:pStyle w:val="ListParagraph"/>
+        <w:numPr>
+          <w:ilvl w:val="0"/>
+          <w:numId w:val="1033"/>
+        </w:numPr>
+        <w:spacing w:before="0" w:beforeAutospacing="off" w:after="0" w:afterAutospacing="off"/>
+        <w:rPr>
+          <w:noProof w:val="0"/>
+          <w:lang w:val="en-US"/>
+        </w:rPr>
+      </w:pPr>
+      <w:r>
+        <w:rPr>
+          <w:noProof w:val="0"/>
+          <w:lang w:val="en-US"/>
+        </w:rPr>
+        <w:t>Skiena, S. S. (2020). The Algorithm Design Manual (3rd ed.). Springer.</w:t>
+      </w:r>
+    </w:p>
+    <w:p>
+      <w:pPr>
+        <w:pStyle w:val="ListParagraph"/>
+        <w:numPr>
+          <w:ilvl w:val="0"/>
+          <w:numId w:val="1033"/>
+        </w:numPr>
+        <w:spacing w:before="0" w:beforeAutospacing="off" w:after="0" w:afterAutospacing="off"/>
+        <w:rPr>
+          <w:noProof w:val="0"/>
+          <w:lang w:val="en-US"/>
+        </w:rPr>
+      </w:pPr>
+      <w:r>
+        <w:rPr>
+          <w:noProof w:val="0"/>
+          <w:lang w:val="en-US"/>
+        </w:rPr>
+        <w:t>Applegate, D. L., Bixby, R. E., Chvátal, V., &amp; Cook, W. J. (2007). The Traveling Salesman Problem: A Computational Study. Princeton University Press.</w:t>
+      </w:r>
+    </w:p>
+    <w:p>
+      <w:pPr>
+        <w:pStyle w:val="ListParagraph"/>
+        <w:numPr>
+          <w:ilvl w:val="0"/>
+          <w:numId w:val="1033"/>
+        </w:numPr>
+        <w:spacing w:before="0" w:beforeAutospacing="off" w:after="0" w:afterAutospacing="off"/>
+        <w:rPr>
+          <w:noProof w:val="0"/>
+          <w:lang w:val="en-US"/>
+        </w:rPr>
+      </w:pPr>
+      <w:r>
+        <w:rPr>
+          <w:noProof w:val="0"/>
+          <w:lang w:val="en-US"/>
+        </w:rPr>
+        <w:t>Browne, C., Powley, E., Whitehouse, D., et al. (2012). A Survey of Monte Carlo Tree Search Methods. IEEE Transactions on Computational Intelligence and AI in Games.</w:t>
+      </w:r>
+    </w:p>
+    <w:p>
+      <w:pPr>
+        <w:pStyle w:val="BodyText"/>
+      </w:pPr>
+    </w:p>
+    <w:p>
+      <w:pPr>
+        <w:pStyle w:val="BodyText"/>
+      </w:pPr>
+    </w:p>
     <w:sectPr>
       <w:pgMar w:top="1440" w:right="1440" w:bottom="1440" w:left="1440"/>
       <w:pgSz w:w="12240" w:h="15840" w:orient="portrait"/>
@@ -20766,6 +20944,91 @@
 
 <file path=word/numbering.xml><?xml version="1.0" encoding="utf-8"?>
 <w:numbering xmlns:w="http://schemas.openxmlformats.org/wordprocessingml/2006/main">
+  <w:abstractNum xmlns:w="http://schemas.openxmlformats.org/wordprocessingml/2006/main" w:abstractNumId="99412">
+    <w:nsid w:val="71d1ba65"/>
+    <w:multiLevelType xmlns:w="http://schemas.openxmlformats.org/wordprocessingml/2006/main" w:val="hybridMultilevel"/>
+    <w:lvl xmlns:w="http://schemas.openxmlformats.org/wordprocessingml/2006/main" w:ilvl="0">
+      <w:start w:val="1"/>
+      <w:numFmt w:val="decimal"/>
+      <w:lvlText w:val="%1."/>
+      <w:lvlJc w:val="left"/>
+      <w:pPr>
+        <w:ind w:left="720" w:hanging="360"/>
+      </w:pPr>
+    </w:lvl>
+    <w:lvl xmlns:w="http://schemas.openxmlformats.org/wordprocessingml/2006/main" w:ilvl="1">
+      <w:start w:val="1"/>
+      <w:numFmt w:val="lowerLetter"/>
+      <w:lvlText w:val="%2."/>
+      <w:lvlJc w:val="left"/>
+      <w:pPr>
+        <w:ind w:left="1440" w:hanging="360"/>
+      </w:pPr>
+    </w:lvl>
+    <w:lvl xmlns:w="http://schemas.openxmlformats.org/wordprocessingml/2006/main" w:ilvl="2">
+      <w:start w:val="1"/>
+      <w:numFmt w:val="lowerRoman"/>
+      <w:lvlText w:val="%3."/>
+      <w:lvlJc w:val="right"/>
+      <w:pPr>
+        <w:ind w:left="2160" w:hanging="180"/>
+      </w:pPr>
+    </w:lvl>
+    <w:lvl xmlns:w="http://schemas.openxmlformats.org/wordprocessingml/2006/main" w:ilvl="3">
+      <w:start w:val="1"/>
+      <w:numFmt w:val="decimal"/>
+      <w:lvlText w:val="%4."/>
+      <w:lvlJc w:val="left"/>
+      <w:pPr>
+        <w:ind w:left="2880" w:hanging="360"/>
+      </w:pPr>
+    </w:lvl>
+    <w:lvl xmlns:w="http://schemas.openxmlformats.org/wordprocessingml/2006/main" w:ilvl="4">
+      <w:start w:val="1"/>
+      <w:numFmt w:val="lowerLetter"/>
+      <w:lvlText w:val="%5."/>
+      <w:lvlJc w:val="left"/>
+      <w:pPr>
+        <w:ind w:left="3600" w:hanging="360"/>
+      </w:pPr>
+    </w:lvl>
+    <w:lvl xmlns:w="http://schemas.openxmlformats.org/wordprocessingml/2006/main" w:ilvl="5">
+      <w:start w:val="1"/>
+      <w:numFmt w:val="lowerRoman"/>
+      <w:lvlText w:val="%6."/>
+      <w:lvlJc w:val="right"/>
+      <w:pPr>
+        <w:ind w:left="4320" w:hanging="180"/>
+      </w:pPr>
+    </w:lvl>
+    <w:lvl xmlns:w="http://schemas.openxmlformats.org/wordprocessingml/2006/main" w:ilvl="6">
+      <w:start w:val="1"/>
+      <w:numFmt w:val="decimal"/>
+      <w:lvlText w:val="%7."/>
+      <w:lvlJc w:val="left"/>
+      <w:pPr>
+        <w:ind w:left="5040" w:hanging="360"/>
+      </w:pPr>
+    </w:lvl>
+    <w:lvl xmlns:w="http://schemas.openxmlformats.org/wordprocessingml/2006/main" w:ilvl="7">
+      <w:start w:val="1"/>
+      <w:numFmt w:val="lowerLetter"/>
+      <w:lvlText w:val="%8."/>
+      <w:lvlJc w:val="left"/>
+      <w:pPr>
+        <w:ind w:left="5760" w:hanging="360"/>
+      </w:pPr>
+    </w:lvl>
+    <w:lvl xmlns:w="http://schemas.openxmlformats.org/wordprocessingml/2006/main" w:ilvl="8">
+      <w:start w:val="1"/>
+      <w:numFmt w:val="lowerRoman"/>
+      <w:lvlText w:val="%9."/>
+      <w:lvlJc w:val="right"/>
+      <w:pPr>
+        <w:ind w:left="6480" w:hanging="180"/>
+      </w:pPr>
+    </w:lvl>
+  </w:abstractNum>
   <w:abstractNum w:abstractNumId="990">
     <w:nsid w:val="A990"/>
     <w:multiLevelType w:val="multilevel"/>
@@ -21003,6 +21266,9 @@
       </w:pPr>
     </w:lvl>
   </w:abstractNum>
+  <w:num w:numId="1033">
+    <w:abstractNumId w:val="99412"/>
+  </w:num>
   <w:num w:numId="1000">
     <w:abstractNumId w:val="990"/>
   </w:num>
@@ -22265,6 +22531,16 @@
       <w:ind w:left="660"/>
     </w:pPr>
   </w:style>
+  <w:style xmlns:w14="http://schemas.microsoft.com/office/word/2010/wordml" xmlns:mc="http://schemas.openxmlformats.org/markup-compatibility/2006" xmlns:w="http://schemas.openxmlformats.org/wordprocessingml/2006/main" w:type="paragraph" w:styleId="ListParagraph" mc:Ignorable="w14">
+    <w:name xmlns:w="http://schemas.openxmlformats.org/wordprocessingml/2006/main" w:val="List Paragraph"/>
+    <w:basedOn xmlns:w="http://schemas.openxmlformats.org/wordprocessingml/2006/main" w:val="Normal"/>
+    <w:uiPriority xmlns:w="http://schemas.openxmlformats.org/wordprocessingml/2006/main" w:val="34"/>
+    <w:qFormat xmlns:w="http://schemas.openxmlformats.org/wordprocessingml/2006/main"/>
+    <w:pPr xmlns:w="http://schemas.openxmlformats.org/wordprocessingml/2006/main">
+      <w:ind xmlns:w="http://schemas.openxmlformats.org/wordprocessingml/2006/main" w:left="720"/>
+      <w:contextualSpacing xmlns:w="http://schemas.openxmlformats.org/wordprocessingml/2006/main"/>
+    </w:pPr>
+  </w:style>
 </w:styles>
 </file>
 

</xml_diff>